<commit_message>
Session review: all six sessions compared, unanswered requests found, next steps proposed
</commit_message>
<xml_diff>
--- a/SESSION_REVIEW_AND_ASSISTANT_2026-10-22/00_START_HERE_Session_Review.docx
+++ b/SESSION_REVIEW_AND_ASSISTANT_2026-10-22/00_START_HERE_Session_Review.docx
@@ -57,13 +57,13 @@
           <w:bCs/>
           <w:b/>
         </w:rPr>
-        <w:t xml:space="preserve">Status: in progress.</w:t>
+        <w:t xml:space="preserve">Status: done.</w:t>
       </w:r>
       <w:r>
         <w:t xml:space="preserve"> </w:t>
       </w:r>
       <w:r>
-        <w:t xml:space="preserve">The assistant is built and tested. The session comparison is being written while the research session’s transcript finishes downloading.</w:t>
+        <w:t xml:space="preserve">The assistant is built and tested, and every session has been compared. The next steps are proposals; nothing has been started.</w:t>
       </w:r>
     </w:p>
     <w:bookmarkEnd w:id="20"/>
@@ -97,7 +97,88 @@
         <w:pStyle w:val="Compact"/>
       </w:pPr>
       <w:r>
-        <w:t xml:space="preserve">Downloaded every transcript page to a private cache (not the repository). The four smaller sessions are done; the research session is still downloading.</w:t>
+        <w:t xml:space="preserve">Downloaded every transcript page to a private cache (not the repository): all 6 sessions, 878 indexed entries.</w:t>
+      </w:r>
+    </w:p>
+    <w:p>
+      <w:pPr>
+        <w:numPr>
+          <w:ilvl w:val="0"/>
+          <w:numId w:val="1001"/>
+        </w:numPr>
+        <w:pStyle w:val="Compact"/>
+      </w:pPr>
+      <w:r>
+        <w:t xml:space="preserve">Read word for word: all 83 owner messages in the research session, and every message and reply in the audit session and the three small sessions.</w:t>
+      </w:r>
+    </w:p>
+    <w:p>
+      <w:pPr>
+        <w:numPr>
+          <w:ilvl w:val="0"/>
+          <w:numId w:val="1001"/>
+        </w:numPr>
+        <w:pStyle w:val="Compact"/>
+      </w:pPr>
+      <w:r>
+        <w:t xml:space="preserve">Found two unanswered requests: the</w:t>
+      </w:r>
+      <w:r>
+        <w:t xml:space="preserve"> </w:t>
+      </w:r>
+      <w:r>
+        <w:t xml:space="preserve">‘</w:t>
+      </w:r>
+      <w:r>
+        <w:t xml:space="preserve">+4</w:t>
+      </w:r>
+      <w:r>
+        <w:t xml:space="preserve">’</w:t>
+      </w:r>
+      <w:r>
+        <w:t xml:space="preserve"> </w:t>
+      </w:r>
+      <w:r>
+        <w:t xml:space="preserve">review (21 Oct, messages 50-55, blocked 5 times by a safety check) and</w:t>
+      </w:r>
+      <w:r>
+        <w:t xml:space="preserve"> </w:t>
+      </w:r>
+      <w:r>
+        <w:t xml:space="preserve">‘</w:t>
+      </w:r>
+      <w:r>
+        <w:t xml:space="preserve">Where is an app key</w:t>
+      </w:r>
+      <w:r>
+        <w:t xml:space="preserve">’</w:t>
+      </w:r>
+      <w:r>
+        <w:t xml:space="preserve"> </w:t>
+      </w:r>
+      <w:r>
+        <w:t xml:space="preserve">(21 Oct).</w:t>
+      </w:r>
+    </w:p>
+    <w:p>
+      <w:pPr>
+        <w:numPr>
+          <w:ilvl w:val="0"/>
+          <w:numId w:val="1001"/>
+        </w:numPr>
+        <w:pStyle w:val="Compact"/>
+      </w:pPr>
+      <w:r>
+        <w:t xml:space="preserve">Wrote the comparison and next steps (</w:t>
+      </w:r>
+      <w:r>
+        <w:rPr>
+          <w:rStyle w:val="VerbatimChar"/>
+        </w:rPr>
+        <w:t xml:space="preserve">1_Sessions_Compared_and_Next</w:t>
+      </w:r>
+      <w:r>
+        <w:t xml:space="preserve">).</w:t>
       </w:r>
     </w:p>
     <w:p>
@@ -260,6 +341,62 @@
             </w:r>
             <w:r>
               <w:t xml:space="preserve">)</w:t>
+            </w:r>
+          </w:p>
+        </w:tc>
+      </w:tr>
+      <w:tr>
+        <w:tc>
+          <w:tcPr/>
+          <w:p>
+            <w:pPr>
+              <w:pStyle w:val="Compact"/>
+              <w:jc w:val="left"/>
+            </w:pPr>
+            <w:r>
+              <w:rPr>
+                <w:rStyle w:val="VerbatimChar"/>
+              </w:rPr>
+              <w:t xml:space="preserve">1_Sessions_Compared_and_Next.docx</w:t>
+            </w:r>
+            <w:r>
+              <w:t xml:space="preserve"> </w:t>
+            </w:r>
+            <w:r>
+              <w:t xml:space="preserve">/</w:t>
+            </w:r>
+            <w:r>
+              <w:t xml:space="preserve"> </w:t>
+            </w:r>
+            <w:r>
+              <w:rPr>
+                <w:rStyle w:val="VerbatimChar"/>
+              </w:rPr>
+              <w:t xml:space="preserve">.md</w:t>
+            </w:r>
+          </w:p>
+        </w:tc>
+        <w:tc>
+          <w:tcPr/>
+          <w:p>
+            <w:pPr>
+              <w:pStyle w:val="Compact"/>
+              <w:jc w:val="left"/>
+            </w:pPr>
+            <w:r>
+              <w:t xml:space="preserve">Every session side by side, what was found only by reading every word, and the proposed next steps</w:t>
+            </w:r>
+          </w:p>
+        </w:tc>
+        <w:tc>
+          <w:tcPr/>
+          <w:p>
+            <w:pPr>
+              <w:pStyle w:val="Compact"/>
+              <w:jc w:val="left"/>
+            </w:pPr>
+            <w:r>
+              <w:t xml:space="preserve">here</w:t>
             </w:r>
           </w:p>
         </w:tc>

</xml_diff>